<commit_message>
Agregado de patrones y uso de los mismos para generar archivo modificados
</commit_message>
<xml_diff>
--- a/Documentacion/Carta a la comision de trabajos finales.docx
+++ b/Documentacion/Carta a la comision de trabajos finales.docx
@@ -35,13 +35,7 @@
     </w:p>
     <w:p>
       <w:r>
-        <w:t xml:space="preserve">S </w:t>
-      </w:r>
-      <w:r>
-        <w:t>________________</w:t>
-      </w:r>
-      <w:r>
-        <w:t xml:space="preserve"> / ________________ D</w:t>
+        <w:t>S ________________ / ________________ D</w:t>
       </w:r>
     </w:p>
     <w:p>
@@ -75,7 +69,31 @@
         <w:spacing w:after="0" w:line="240" w:lineRule="auto"/>
       </w:pPr>
       <w:r>
-        <w:t>El proyecto se centrará en el lenguaje de programación Rust, un lenguaje compilado, multiparadigma y de propósito general, diseñado para desarrollar software seguro, eficiente y confiable. Su principal innovación radica en un sistema de tipos basado en el concepto de ownership, que permite gestionar la memoria de forma automática sin necesidad de un recolector de basura, gracias a la restricción del aliasing. Este sistema también previene condiciones de carrera en programas concurrentes, imponiendo una disciplina rigurosa en el manejo de la memoria.</w:t>
+        <w:t xml:space="preserve">El proyecto se centrará en el lenguaje de programación </w:t>
+      </w:r>
+      <w:proofErr w:type="spellStart"/>
+      <w:r>
+        <w:t>Rust</w:t>
+      </w:r>
+      <w:proofErr w:type="spellEnd"/>
+      <w:r>
+        <w:t xml:space="preserve">, un lenguaje compilado, multiparadigma y de propósito general, diseñado para desarrollar software seguro, eficiente y confiable. Su principal innovación radica en un sistema de tipos basado en el concepto de </w:t>
+      </w:r>
+      <w:proofErr w:type="spellStart"/>
+      <w:r>
+        <w:t>ownership</w:t>
+      </w:r>
+      <w:proofErr w:type="spellEnd"/>
+      <w:r>
+        <w:t xml:space="preserve">, que permite gestionar la memoria de forma automática sin necesidad de un recolector de basura, gracias a la restricción del </w:t>
+      </w:r>
+      <w:proofErr w:type="spellStart"/>
+      <w:r>
+        <w:t>aliasing</w:t>
+      </w:r>
+      <w:proofErr w:type="spellEnd"/>
+      <w:r>
+        <w:t>. Este sistema también previene condiciones de carrera en programas concurrentes, imponiendo una disciplina rigurosa en el manejo de la memoria.</w:t>
       </w:r>
     </w:p>
     <w:p>
@@ -88,7 +106,47 @@
         <w:spacing w:after="0" w:line="240" w:lineRule="auto"/>
       </w:pPr>
       <w:r>
-        <w:t>Sin embargo, las restricciones sobre el aliasing —especialmente en valores mutables— dificultan la implementación de estructuras de datos dinámicas mediante punteros o referencias con aliasing. Por ello, Rust permite el uso de bloques de código unsafe, que habilitan operaciones que requieren acceso directo a memoria, referencias o desreferenciación de variables, entre otras.</w:t>
+        <w:t xml:space="preserve">Sin embargo, las restricciones sobre el </w:t>
+      </w:r>
+      <w:proofErr w:type="spellStart"/>
+      <w:r>
+        <w:t>aliasing</w:t>
+      </w:r>
+      <w:proofErr w:type="spellEnd"/>
+      <w:r>
+        <w:t xml:space="preserve"> —especialmente en valores mutables— dificultan la implementación de estructuras de datos dinámicas mediante punteros o referencias con </w:t>
+      </w:r>
+      <w:proofErr w:type="spellStart"/>
+      <w:r>
+        <w:t>aliasing</w:t>
+      </w:r>
+      <w:proofErr w:type="spellEnd"/>
+      <w:r>
+        <w:t xml:space="preserve">. Por ello, </w:t>
+      </w:r>
+      <w:proofErr w:type="spellStart"/>
+      <w:r>
+        <w:t>Rust</w:t>
+      </w:r>
+      <w:proofErr w:type="spellEnd"/>
+      <w:r>
+        <w:t xml:space="preserve"> permite el uso de bloques de código </w:t>
+      </w:r>
+      <w:proofErr w:type="spellStart"/>
+      <w:r>
+        <w:t>unsafe</w:t>
+      </w:r>
+      <w:proofErr w:type="spellEnd"/>
+      <w:r>
+        <w:t xml:space="preserve">, que habilitan operaciones que requieren acceso directo a memoria, referencias o </w:t>
+      </w:r>
+      <w:proofErr w:type="spellStart"/>
+      <w:r>
+        <w:t>desreferenciación</w:t>
+      </w:r>
+      <w:proofErr w:type="spellEnd"/>
+      <w:r>
+        <w:t xml:space="preserve"> de variables, entre otras.</w:t>
       </w:r>
     </w:p>
     <w:p>
@@ -114,7 +172,15 @@
         <w:spacing w:after="0" w:line="240" w:lineRule="auto"/>
       </w:pPr>
       <w:r>
-        <w:t>1. Detectar el uso de punteros en bloques unsafe.</w:t>
+        <w:t xml:space="preserve">1. Detectar el uso de punteros en bloques </w:t>
+      </w:r>
+      <w:proofErr w:type="spellStart"/>
+      <w:r>
+        <w:t>unsafe</w:t>
+      </w:r>
+      <w:proofErr w:type="spellEnd"/>
+      <w:r>
+        <w:t>.</w:t>
       </w:r>
     </w:p>
     <w:p>
@@ -138,7 +204,23 @@
         <w:spacing w:after="0" w:line="240" w:lineRule="auto"/>
       </w:pPr>
       <w:r>
-        <w:t>4. Implementar una herramienta de software que, dado un archivo o directorio escrito en Rust, procese y modifique el código, devolviendo una versión funcionalmente equivalente con menor uso de bloques unsafe.</w:t>
+        <w:t xml:space="preserve">4. Implementar una herramienta de software que, dado un archivo o directorio escrito en </w:t>
+      </w:r>
+      <w:proofErr w:type="spellStart"/>
+      <w:r>
+        <w:t>Rust</w:t>
+      </w:r>
+      <w:proofErr w:type="spellEnd"/>
+      <w:r>
+        <w:t xml:space="preserve">, procese y modifique el código, devolviendo una versión funcionalmente equivalente con menor uso de bloques </w:t>
+      </w:r>
+      <w:proofErr w:type="spellStart"/>
+      <w:r>
+        <w:t>unsafe</w:t>
+      </w:r>
+      <w:proofErr w:type="spellEnd"/>
+      <w:r>
+        <w:t>.</w:t>
       </w:r>
     </w:p>
     <w:p>
@@ -164,7 +246,15 @@
         <w:spacing w:after="0" w:line="240" w:lineRule="auto"/>
       </w:pPr>
       <w:r>
-        <w:t>1. Los programadores que se inician en Rust tienden a trabajar las referencias de manera similar a lenguajes como C.</w:t>
+        <w:t xml:space="preserve">1. Los programadores que se inician en </w:t>
+      </w:r>
+      <w:proofErr w:type="spellStart"/>
+      <w:r>
+        <w:t>Rust</w:t>
+      </w:r>
+      <w:proofErr w:type="spellEnd"/>
+      <w:r>
+        <w:t xml:space="preserve"> tienden a trabajar las referencias de manera similar a lenguajes como C.</w:t>
       </w:r>
     </w:p>
     <w:p>
@@ -172,7 +262,15 @@
         <w:spacing w:after="0" w:line="240" w:lineRule="auto"/>
       </w:pPr>
       <w:r>
-        <w:t>2. El manejo de referencias se simplifica cuando no se considera la noción de ownership.</w:t>
+        <w:t xml:space="preserve">2. El manejo de referencias se simplifica cuando no se considera la noción de </w:t>
+      </w:r>
+      <w:proofErr w:type="spellStart"/>
+      <w:r>
+        <w:t>ownership</w:t>
+      </w:r>
+      <w:proofErr w:type="spellEnd"/>
+      <w:r>
+        <w:t>.</w:t>
       </w:r>
     </w:p>
     <w:p>
@@ -493,8 +591,51 @@
               <w:rPr>
                 <w:rFonts w:cstheme="minorHAnsi"/>
               </w:rPr>
-              <w:t xml:space="preserve">Investigar sobre Rust, ownership, aliasing, bloques </w:t>
-            </w:r>
+              <w:t xml:space="preserve">Investigar sobre </w:t>
+            </w:r>
+            <w:proofErr w:type="spellStart"/>
+            <w:r>
+              <w:rPr>
+                <w:rFonts w:cstheme="minorHAnsi"/>
+              </w:rPr>
+              <w:t>Rust</w:t>
+            </w:r>
+            <w:proofErr w:type="spellEnd"/>
+            <w:r>
+              <w:rPr>
+                <w:rFonts w:cstheme="minorHAnsi"/>
+              </w:rPr>
+              <w:t xml:space="preserve">, </w:t>
+            </w:r>
+            <w:proofErr w:type="spellStart"/>
+            <w:r>
+              <w:rPr>
+                <w:rFonts w:cstheme="minorHAnsi"/>
+              </w:rPr>
+              <w:t>ownership</w:t>
+            </w:r>
+            <w:proofErr w:type="spellEnd"/>
+            <w:r>
+              <w:rPr>
+                <w:rFonts w:cstheme="minorHAnsi"/>
+              </w:rPr>
+              <w:t xml:space="preserve">, </w:t>
+            </w:r>
+            <w:proofErr w:type="spellStart"/>
+            <w:r>
+              <w:rPr>
+                <w:rFonts w:cstheme="minorHAnsi"/>
+              </w:rPr>
+              <w:t>aliasing</w:t>
+            </w:r>
+            <w:proofErr w:type="spellEnd"/>
+            <w:r>
+              <w:rPr>
+                <w:rFonts w:cstheme="minorHAnsi"/>
+              </w:rPr>
+              <w:t xml:space="preserve">, bloques </w:t>
+            </w:r>
+            <w:proofErr w:type="spellStart"/>
             <w:r>
               <w:rPr>
                 <w:rFonts w:cstheme="minorHAnsi"/>
@@ -503,6 +644,7 @@
               </w:rPr>
               <w:t>unsafe</w:t>
             </w:r>
+            <w:proofErr w:type="spellEnd"/>
             <w:r>
               <w:rPr>
                 <w:rFonts w:cstheme="minorHAnsi"/>
@@ -739,8 +881,16 @@
               <w:rPr>
                 <w:rFonts w:cstheme="minorHAnsi"/>
               </w:rPr>
-              <w:t xml:space="preserve"> unsafe</w:t>
-            </w:r>
+              <w:t xml:space="preserve"> </w:t>
+            </w:r>
+            <w:proofErr w:type="spellStart"/>
+            <w:r>
+              <w:rPr>
+                <w:rFonts w:cstheme="minorHAnsi"/>
+              </w:rPr>
+              <w:t>unsafe</w:t>
+            </w:r>
+            <w:proofErr w:type="spellEnd"/>
             <w:r>
               <w:rPr>
                 <w:rFonts w:cstheme="minorHAnsi"/>
@@ -1363,378 +1513,387 @@
           <w:noProof/>
         </w:rPr>
         <mc:AlternateContent>
-          <mc:Choice Requires="wps">
+          <mc:Choice Requires="wpg">
             <w:drawing>
-              <wp:anchor distT="0" distB="0" distL="114300" distR="114300" simplePos="0" relativeHeight="251659264" behindDoc="0" locked="0" layoutInCell="1" allowOverlap="1" wp14:anchorId="2E9E2EF5" wp14:editId="1BF92265">
+              <wp:anchor distT="0" distB="0" distL="114300" distR="114300" simplePos="0" relativeHeight="251661312" behindDoc="0" locked="0" layoutInCell="1" allowOverlap="1" wp14:anchorId="071B223B" wp14:editId="4AA59A51">
                 <wp:simplePos x="0" y="0"/>
                 <wp:positionH relativeFrom="column">
-                  <wp:posOffset>-635</wp:posOffset>
+                  <wp:posOffset>-51435</wp:posOffset>
                 </wp:positionH>
-                <wp:positionV relativeFrom="page">
-                  <wp:posOffset>8655050</wp:posOffset>
+                <wp:positionV relativeFrom="paragraph">
+                  <wp:posOffset>7037705</wp:posOffset>
                 </wp:positionV>
-                <wp:extent cx="5359400" cy="615950"/>
+                <wp:extent cx="5410200" cy="1333500"/>
                 <wp:effectExtent l="0" t="0" r="0" b="0"/>
                 <wp:wrapNone/>
-                <wp:docPr id="79921652" name="Cuadro de texto 1"/>
+                <wp:docPr id="1859666728" name="Grupo 5"/>
                 <wp:cNvGraphicFramePr/>
                 <a:graphic xmlns:a="http://schemas.openxmlformats.org/drawingml/2006/main">
-                  <a:graphicData uri="http://schemas.microsoft.com/office/word/2010/wordprocessingShape">
-                    <wps:wsp>
-                      <wps:cNvSpPr txBox="1"/>
-                      <wps:spPr>
+                  <a:graphicData uri="http://schemas.microsoft.com/office/word/2010/wordprocessingGroup">
+                    <wpg:wgp>
+                      <wpg:cNvGrpSpPr/>
+                      <wpg:grpSpPr>
                         <a:xfrm>
                           <a:off x="0" y="0"/>
-                          <a:ext cx="5359400" cy="615950"/>
+                          <a:ext cx="5410200" cy="1333500"/>
+                          <a:chOff x="0" y="0"/>
+                          <a:chExt cx="5410200" cy="1333500"/>
                         </a:xfrm>
-                        <a:prstGeom prst="rect">
-                          <a:avLst/>
-                        </a:prstGeom>
-                        <a:solidFill>
-                          <a:schemeClr val="lt1"/>
-                        </a:solidFill>
-                        <a:ln w="6350">
+                      </wpg:grpSpPr>
+                      <wps:wsp>
+                        <wps:cNvPr id="1609386078" name="Cuadro de texto 1"/>
+                        <wps:cNvSpPr txBox="1"/>
+                        <wps:spPr>
+                          <a:xfrm>
+                            <a:off x="50800" y="717550"/>
+                            <a:ext cx="5359400" cy="615950"/>
+                          </a:xfrm>
+                          <a:prstGeom prst="rect">
+                            <a:avLst/>
+                          </a:prstGeom>
+                          <a:solidFill>
+                            <a:schemeClr val="lt1"/>
+                          </a:solidFill>
+                          <a:ln w="6350">
+                            <a:noFill/>
+                          </a:ln>
+                        </wps:spPr>
+                        <wps:txbx>
+                          <w:txbxContent>
+                            <w:p>
+                              <w:pPr>
+                                <w:spacing w:after="0" w:line="240" w:lineRule="auto"/>
+                                <w:rPr>
+                                  <w:rFonts w:cstheme="minorHAnsi"/>
+                                </w:rPr>
+                              </w:pPr>
+                              <w:r>
+                                <w:rPr>
+                                  <w:rFonts w:cstheme="minorHAnsi"/>
+                                </w:rPr>
+                                <w:t>______________________</w:t>
+                              </w:r>
+                              <w:r>
+                                <w:rPr>
+                                  <w:rFonts w:cstheme="minorHAnsi"/>
+                                </w:rPr>
+                                <w:tab/>
+                              </w:r>
+                              <w:r>
+                                <w:rPr>
+                                  <w:rFonts w:cstheme="minorHAnsi"/>
+                                </w:rPr>
+                                <w:tab/>
+                              </w:r>
+                              <w:r>
+                                <w:rPr>
+                                  <w:rFonts w:cstheme="minorHAnsi"/>
+                                </w:rPr>
+                                <w:tab/>
+                              </w:r>
+                              <w:r>
+                                <w:rPr>
+                                  <w:rFonts w:cstheme="minorHAnsi"/>
+                                </w:rPr>
+                                <w:tab/>
+                                <w:t xml:space="preserve">       _______________________</w:t>
+                              </w:r>
+                            </w:p>
+                            <w:p>
+                              <w:pPr>
+                                <w:spacing w:after="0" w:line="240" w:lineRule="auto"/>
+                                <w:rPr>
+                                  <w:rFonts w:cstheme="minorHAnsi"/>
+                                </w:rPr>
+                              </w:pPr>
+                              <w:r>
+                                <w:rPr>
+                                  <w:rFonts w:cstheme="minorHAnsi"/>
+                                </w:rPr>
+                                <w:t xml:space="preserve">        Firma del Alumno</w:t>
+                              </w:r>
+                              <w:r>
+                                <w:rPr>
+                                  <w:rFonts w:cstheme="minorHAnsi"/>
+                                </w:rPr>
+                                <w:tab/>
+                              </w:r>
+                              <w:r>
+                                <w:rPr>
+                                  <w:rFonts w:cstheme="minorHAnsi"/>
+                                </w:rPr>
+                                <w:tab/>
+                              </w:r>
+                              <w:r>
+                                <w:rPr>
+                                  <w:rFonts w:cstheme="minorHAnsi"/>
+                                </w:rPr>
+                                <w:tab/>
+                              </w:r>
+                              <w:r>
+                                <w:rPr>
+                                  <w:rFonts w:cstheme="minorHAnsi"/>
+                                </w:rPr>
+                                <w:tab/>
+                              </w:r>
+                              <w:r>
+                                <w:rPr>
+                                  <w:rFonts w:cstheme="minorHAnsi"/>
+                                </w:rPr>
+                                <w:tab/>
+                              </w:r>
+                              <w:proofErr w:type="gramStart"/>
+                              <w:r>
+                                <w:rPr>
+                                  <w:rFonts w:cstheme="minorHAnsi"/>
+                                </w:rPr>
+                                <w:tab/>
+                                <w:t xml:space="preserve">  Firma</w:t>
+                              </w:r>
+                              <w:proofErr w:type="gramEnd"/>
+                              <w:r>
+                                <w:rPr>
+                                  <w:rFonts w:cstheme="minorHAnsi"/>
+                                </w:rPr>
+                                <w:t xml:space="preserve"> del Docente</w:t>
+                              </w:r>
+                            </w:p>
+                            <w:p/>
+                          </w:txbxContent>
+                        </wps:txbx>
+                        <wps:bodyPr rot="0" spcFirstLastPara="0" vertOverflow="overflow" horzOverflow="overflow" vert="horz" wrap="square" lIns="91440" tIns="45720" rIns="91440" bIns="45720" numCol="1" spcCol="0" rtlCol="0" fromWordArt="0" anchor="t" anchorCtr="0" forceAA="0" compatLnSpc="1">
+                          <a:prstTxWarp prst="textNoShape">
+                            <a:avLst/>
+                          </a:prstTxWarp>
+                          <a:noAutofit/>
+                        </wps:bodyPr>
+                      </wps:wsp>
+                      <pic:pic xmlns:pic="http://schemas.openxmlformats.org/drawingml/2006/picture">
+                        <pic:nvPicPr>
+                          <pic:cNvPr id="1563076996" name="Imagen 2"/>
+                          <pic:cNvPicPr>
+                            <a:picLocks noChangeAspect="1"/>
+                          </pic:cNvPicPr>
+                        </pic:nvPicPr>
+                        <pic:blipFill rotWithShape="1">
+                          <a:blip r:embed="rId6">
+                            <a:extLst>
+                              <a:ext uri="{28A0092B-C50C-407E-A947-70E740481C1C}">
+                                <a14:useLocalDpi xmlns:a14="http://schemas.microsoft.com/office/drawing/2010/main" val="0"/>
+                              </a:ext>
+                            </a:extLst>
+                          </a:blip>
+                          <a:srcRect t="22059" b="19608"/>
+                          <a:stretch>
+                            <a:fillRect/>
+                          </a:stretch>
+                        </pic:blipFill>
+                        <pic:spPr bwMode="auto">
+                          <a:xfrm>
+                            <a:off x="3568700" y="0"/>
+                            <a:ext cx="1600200" cy="755650"/>
+                          </a:xfrm>
+                          <a:prstGeom prst="rect">
+                            <a:avLst/>
+                          </a:prstGeom>
                           <a:noFill/>
-                        </a:ln>
-                      </wps:spPr>
-                      <wps:txbx>
-                        <w:txbxContent>
-                          <w:p>
-                            <w:pPr>
-                              <w:spacing w:after="0" w:line="240" w:lineRule="auto"/>
-                              <w:rPr>
-                                <w:rFonts w:cstheme="minorHAnsi"/>
-                              </w:rPr>
-                            </w:pPr>
-                            <w:r>
-                              <w:rPr>
-                                <w:rFonts w:cstheme="minorHAnsi"/>
-                              </w:rPr>
-                              <w:t>___</w:t>
-                            </w:r>
-                            <w:r>
-                              <w:rPr>
-                                <w:rFonts w:cstheme="minorHAnsi"/>
-                              </w:rPr>
-                              <w:t>__</w:t>
-                            </w:r>
-                            <w:r>
-                              <w:rPr>
-                                <w:rFonts w:cstheme="minorHAnsi"/>
-                              </w:rPr>
-                              <w:t>________</w:t>
-                            </w:r>
-                            <w:r>
-                              <w:rPr>
-                                <w:rFonts w:cstheme="minorHAnsi"/>
-                              </w:rPr>
-                              <w:t>__</w:t>
-                            </w:r>
-                            <w:r>
-                              <w:rPr>
-                                <w:rFonts w:cstheme="minorHAnsi"/>
-                              </w:rPr>
-                              <w:t>_______</w:t>
-                            </w:r>
-                            <w:r>
-                              <w:rPr>
-                                <w:rFonts w:cstheme="minorHAnsi"/>
-                              </w:rPr>
-                              <w:tab/>
-                            </w:r>
-                            <w:r>
-                              <w:rPr>
-                                <w:rFonts w:cstheme="minorHAnsi"/>
-                              </w:rPr>
-                              <w:tab/>
-                            </w:r>
-                            <w:r>
-                              <w:rPr>
-                                <w:rFonts w:cstheme="minorHAnsi"/>
-                              </w:rPr>
-                              <w:tab/>
-                            </w:r>
-                            <w:r>
-                              <w:rPr>
-                                <w:rFonts w:cstheme="minorHAnsi"/>
-                              </w:rPr>
-                              <w:tab/>
-                              <w:t xml:space="preserve">       _</w:t>
-                            </w:r>
-                            <w:r>
-                              <w:rPr>
-                                <w:rFonts w:cstheme="minorHAnsi"/>
-                              </w:rPr>
-                              <w:t>__</w:t>
-                            </w:r>
-                            <w:r>
-                              <w:rPr>
-                                <w:rFonts w:cstheme="minorHAnsi"/>
-                              </w:rPr>
-                              <w:t>___</w:t>
-                            </w:r>
-                            <w:r>
-                              <w:rPr>
-                                <w:rFonts w:cstheme="minorHAnsi"/>
-                              </w:rPr>
-                              <w:t>_________________</w:t>
-                            </w:r>
-                          </w:p>
-                          <w:p>
-                            <w:pPr>
-                              <w:spacing w:after="0" w:line="240" w:lineRule="auto"/>
-                              <w:rPr>
-                                <w:rFonts w:cstheme="minorHAnsi"/>
-                              </w:rPr>
-                            </w:pPr>
-                            <w:r>
-                              <w:rPr>
-                                <w:rFonts w:cstheme="minorHAnsi"/>
-                              </w:rPr>
-                              <w:t xml:space="preserve">        </w:t>
-                            </w:r>
-                            <w:r>
-                              <w:rPr>
-                                <w:rFonts w:cstheme="minorHAnsi"/>
-                              </w:rPr>
-                              <w:t>Firma del Alumno</w:t>
-                            </w:r>
-                            <w:r>
-                              <w:rPr>
-                                <w:rFonts w:cstheme="minorHAnsi"/>
-                              </w:rPr>
-                              <w:tab/>
-                            </w:r>
-                            <w:r>
-                              <w:rPr>
-                                <w:rFonts w:cstheme="minorHAnsi"/>
-                              </w:rPr>
-                              <w:tab/>
-                            </w:r>
-                            <w:r>
-                              <w:rPr>
-                                <w:rFonts w:cstheme="minorHAnsi"/>
-                              </w:rPr>
-                              <w:tab/>
-                            </w:r>
-                            <w:r>
-                              <w:rPr>
-                                <w:rFonts w:cstheme="minorHAnsi"/>
-                              </w:rPr>
-                              <w:tab/>
-                            </w:r>
-                            <w:r>
-                              <w:rPr>
-                                <w:rFonts w:cstheme="minorHAnsi"/>
-                              </w:rPr>
-                              <w:tab/>
-                            </w:r>
-                            <w:r>
-                              <w:rPr>
-                                <w:rFonts w:cstheme="minorHAnsi"/>
-                              </w:rPr>
-                              <w:tab/>
-                            </w:r>
-                            <w:r>
-                              <w:rPr>
-                                <w:rFonts w:cstheme="minorHAnsi"/>
-                              </w:rPr>
-                              <w:t xml:space="preserve">  </w:t>
-                            </w:r>
-                            <w:r>
-                              <w:rPr>
-                                <w:rFonts w:cstheme="minorHAnsi"/>
-                              </w:rPr>
-                              <w:t>Firma del Docente</w:t>
-                            </w:r>
-                          </w:p>
-                          <w:p/>
-                        </w:txbxContent>
-                      </wps:txbx>
-                      <wps:bodyPr rot="0" spcFirstLastPara="0" vertOverflow="overflow" horzOverflow="overflow" vert="horz" wrap="square" lIns="91440" tIns="45720" rIns="91440" bIns="45720" numCol="1" spcCol="0" rtlCol="0" fromWordArt="0" anchor="t" anchorCtr="0" forceAA="0" compatLnSpc="1">
-                        <a:prstTxWarp prst="textNoShape">
-                          <a:avLst/>
-                        </a:prstTxWarp>
-                        <a:noAutofit/>
-                      </wps:bodyPr>
-                    </wps:wsp>
+                          <a:ln>
+                            <a:noFill/>
+                          </a:ln>
+                          <a:extLst>
+                            <a:ext uri="{53640926-AAD7-44D8-BBD7-CCE9431645EC}">
+                              <a14:shadowObscured xmlns:a14="http://schemas.microsoft.com/office/drawing/2010/main"/>
+                            </a:ext>
+                          </a:extLst>
+                        </pic:spPr>
+                      </pic:pic>
+                      <pic:pic xmlns:pic="http://schemas.openxmlformats.org/drawingml/2006/picture">
+                        <pic:nvPicPr>
+                          <pic:cNvPr id="759950329" name="Imagen 3"/>
+                          <pic:cNvPicPr>
+                            <a:picLocks noChangeAspect="1"/>
+                          </pic:cNvPicPr>
+                        </pic:nvPicPr>
+                        <pic:blipFill>
+                          <a:blip r:embed="rId7">
+                            <a:extLst>
+                              <a:ext uri="{28A0092B-C50C-407E-A947-70E740481C1C}">
+                                <a14:useLocalDpi xmlns:a14="http://schemas.microsoft.com/office/drawing/2010/main" val="0"/>
+                              </a:ext>
+                            </a:extLst>
+                          </a:blip>
+                          <a:srcRect/>
+                          <a:stretch>
+                            <a:fillRect/>
+                          </a:stretch>
+                        </pic:blipFill>
+                        <pic:spPr bwMode="auto">
+                          <a:xfrm>
+                            <a:off x="0" y="82550"/>
+                            <a:ext cx="1720850" cy="635000"/>
+                          </a:xfrm>
+                          <a:prstGeom prst="rect">
+                            <a:avLst/>
+                          </a:prstGeom>
+                          <a:noFill/>
+                          <a:ln>
+                            <a:noFill/>
+                          </a:ln>
+                        </pic:spPr>
+                      </pic:pic>
+                    </wpg:wgp>
                   </a:graphicData>
                 </a:graphic>
-                <wp14:sizeRelH relativeFrom="margin">
-                  <wp14:pctWidth>0</wp14:pctWidth>
-                </wp14:sizeRelH>
-                <wp14:sizeRelV relativeFrom="margin">
-                  <wp14:pctHeight>0</wp14:pctHeight>
-                </wp14:sizeRelV>
               </wp:anchor>
             </w:drawing>
           </mc:Choice>
           <mc:Fallback>
             <w:pict>
-              <v:shapetype w14:anchorId="2E9E2EF5" id="_x0000_t202" coordsize="21600,21600" o:spt="202" path="m,l,21600r21600,l21600,xe">
-                <v:stroke joinstyle="miter"/>
-                <v:path gradientshapeok="t" o:connecttype="rect"/>
-              </v:shapetype>
-              <v:shape id="Cuadro de texto 1" o:spid="_x0000_s1026" type="#_x0000_t202" style="position:absolute;margin-left:-.05pt;margin-top:681.5pt;width:422pt;height:48.5pt;z-index:251659264;visibility:visible;mso-wrap-style:square;mso-width-percent:0;mso-height-percent:0;mso-wrap-distance-left:9pt;mso-wrap-distance-top:0;mso-wrap-distance-right:9pt;mso-wrap-distance-bottom:0;mso-position-horizontal:absolute;mso-position-horizontal-relative:text;mso-position-vertical:absolute;mso-position-vertical-relative:page;mso-width-percent:0;mso-height-percent:0;mso-width-relative:margin;mso-height-relative:margin;v-text-anchor:top" o:gfxdata="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" fillcolor="white [3201]" stroked="f" strokeweight=".5pt">
-                <v:textbox>
-                  <w:txbxContent>
-                    <w:p>
-                      <w:pPr>
-                        <w:spacing w:after="0" w:line="240" w:lineRule="auto"/>
-                        <w:rPr>
-                          <w:rFonts w:cstheme="minorHAnsi"/>
-                        </w:rPr>
-                      </w:pPr>
-                      <w:r>
-                        <w:rPr>
-                          <w:rFonts w:cstheme="minorHAnsi"/>
-                        </w:rPr>
-                        <w:t>___</w:t>
-                      </w:r>
-                      <w:r>
-                        <w:rPr>
-                          <w:rFonts w:cstheme="minorHAnsi"/>
-                        </w:rPr>
-                        <w:t>__</w:t>
-                      </w:r>
-                      <w:r>
-                        <w:rPr>
-                          <w:rFonts w:cstheme="minorHAnsi"/>
-                        </w:rPr>
-                        <w:t>________</w:t>
-                      </w:r>
-                      <w:r>
-                        <w:rPr>
-                          <w:rFonts w:cstheme="minorHAnsi"/>
-                        </w:rPr>
-                        <w:t>__</w:t>
-                      </w:r>
-                      <w:r>
-                        <w:rPr>
-                          <w:rFonts w:cstheme="minorHAnsi"/>
-                        </w:rPr>
-                        <w:t>_______</w:t>
-                      </w:r>
-                      <w:r>
-                        <w:rPr>
-                          <w:rFonts w:cstheme="minorHAnsi"/>
-                        </w:rPr>
-                        <w:tab/>
-                      </w:r>
-                      <w:r>
-                        <w:rPr>
-                          <w:rFonts w:cstheme="minorHAnsi"/>
-                        </w:rPr>
-                        <w:tab/>
-                      </w:r>
-                      <w:r>
-                        <w:rPr>
-                          <w:rFonts w:cstheme="minorHAnsi"/>
-                        </w:rPr>
-                        <w:tab/>
-                      </w:r>
-                      <w:r>
-                        <w:rPr>
-                          <w:rFonts w:cstheme="minorHAnsi"/>
-                        </w:rPr>
-                        <w:tab/>
-                        <w:t xml:space="preserve">       _</w:t>
-                      </w:r>
-                      <w:r>
-                        <w:rPr>
-                          <w:rFonts w:cstheme="minorHAnsi"/>
-                        </w:rPr>
-                        <w:t>__</w:t>
-                      </w:r>
-                      <w:r>
-                        <w:rPr>
-                          <w:rFonts w:cstheme="minorHAnsi"/>
-                        </w:rPr>
-                        <w:t>___</w:t>
-                      </w:r>
-                      <w:r>
-                        <w:rPr>
-                          <w:rFonts w:cstheme="minorHAnsi"/>
-                        </w:rPr>
-                        <w:t>_________________</w:t>
-                      </w:r>
-                    </w:p>
-                    <w:p>
-                      <w:pPr>
-                        <w:spacing w:after="0" w:line="240" w:lineRule="auto"/>
-                        <w:rPr>
-                          <w:rFonts w:cstheme="minorHAnsi"/>
-                        </w:rPr>
-                      </w:pPr>
-                      <w:r>
-                        <w:rPr>
-                          <w:rFonts w:cstheme="minorHAnsi"/>
-                        </w:rPr>
-                        <w:t xml:space="preserve">        </w:t>
-                      </w:r>
-                      <w:r>
-                        <w:rPr>
-                          <w:rFonts w:cstheme="minorHAnsi"/>
-                        </w:rPr>
-                        <w:t>Firma del Alumno</w:t>
-                      </w:r>
-                      <w:r>
-                        <w:rPr>
-                          <w:rFonts w:cstheme="minorHAnsi"/>
-                        </w:rPr>
-                        <w:tab/>
-                      </w:r>
-                      <w:r>
-                        <w:rPr>
-                          <w:rFonts w:cstheme="minorHAnsi"/>
-                        </w:rPr>
-                        <w:tab/>
-                      </w:r>
-                      <w:r>
-                        <w:rPr>
-                          <w:rFonts w:cstheme="minorHAnsi"/>
-                        </w:rPr>
-                        <w:tab/>
-                      </w:r>
-                      <w:r>
-                        <w:rPr>
-                          <w:rFonts w:cstheme="minorHAnsi"/>
-                        </w:rPr>
-                        <w:tab/>
-                      </w:r>
-                      <w:r>
-                        <w:rPr>
-                          <w:rFonts w:cstheme="minorHAnsi"/>
-                        </w:rPr>
-                        <w:tab/>
-                      </w:r>
-                      <w:r>
-                        <w:rPr>
-                          <w:rFonts w:cstheme="minorHAnsi"/>
-                        </w:rPr>
-                        <w:tab/>
-                      </w:r>
-                      <w:r>
-                        <w:rPr>
-                          <w:rFonts w:cstheme="minorHAnsi"/>
-                        </w:rPr>
-                        <w:t xml:space="preserve">  </w:t>
-                      </w:r>
-                      <w:r>
-                        <w:rPr>
-                          <w:rFonts w:cstheme="minorHAnsi"/>
-                        </w:rPr>
-                        <w:t>Firma del Docente</w:t>
-                      </w:r>
-                    </w:p>
-                    <w:p/>
-                  </w:txbxContent>
-                </v:textbox>
-                <w10:wrap anchory="page"/>
-              </v:shape>
+              <v:group w14:anchorId="071B223B" id="Grupo 5" o:spid="_x0000_s1026" style="position:absolute;margin-left:-4.05pt;margin-top:554.15pt;width:426pt;height:105pt;z-index:251661312" coordsize="54102,13335" o:gfxdata="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">
+                <v:shapetype id="_x0000_t202" coordsize="21600,21600" o:spt="202" path="m,l,21600r21600,l21600,xe">
+                  <v:stroke joinstyle="miter"/>
+                  <v:path gradientshapeok="t" o:connecttype="rect"/>
+                </v:shapetype>
+                <v:shape id="Cuadro de texto 1" o:spid="_x0000_s1027" type="#_x0000_t202" style="position:absolute;left:508;top:7175;width:53594;height:6160;visibility:visible;mso-wrap-style:square;v-text-anchor:top" o:gfxdata="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" fillcolor="white [3201]" stroked="f" strokeweight=".5pt">
+                  <v:textbox>
+                    <w:txbxContent>
+                      <w:p>
+                        <w:pPr>
+                          <w:spacing w:after="0" w:line="240" w:lineRule="auto"/>
+                          <w:rPr>
+                            <w:rFonts w:cstheme="minorHAnsi"/>
+                          </w:rPr>
+                        </w:pPr>
+                        <w:r>
+                          <w:rPr>
+                            <w:rFonts w:cstheme="minorHAnsi"/>
+                          </w:rPr>
+                          <w:t>______________________</w:t>
+                        </w:r>
+                        <w:r>
+                          <w:rPr>
+                            <w:rFonts w:cstheme="minorHAnsi"/>
+                          </w:rPr>
+                          <w:tab/>
+                        </w:r>
+                        <w:r>
+                          <w:rPr>
+                            <w:rFonts w:cstheme="minorHAnsi"/>
+                          </w:rPr>
+                          <w:tab/>
+                        </w:r>
+                        <w:r>
+                          <w:rPr>
+                            <w:rFonts w:cstheme="minorHAnsi"/>
+                          </w:rPr>
+                          <w:tab/>
+                        </w:r>
+                        <w:r>
+                          <w:rPr>
+                            <w:rFonts w:cstheme="minorHAnsi"/>
+                          </w:rPr>
+                          <w:tab/>
+                          <w:t xml:space="preserve">       _______________________</w:t>
+                        </w:r>
+                      </w:p>
+                      <w:p>
+                        <w:pPr>
+                          <w:spacing w:after="0" w:line="240" w:lineRule="auto"/>
+                          <w:rPr>
+                            <w:rFonts w:cstheme="minorHAnsi"/>
+                          </w:rPr>
+                        </w:pPr>
+                        <w:r>
+                          <w:rPr>
+                            <w:rFonts w:cstheme="minorHAnsi"/>
+                          </w:rPr>
+                          <w:t xml:space="preserve">        Firma del Alumno</w:t>
+                        </w:r>
+                        <w:r>
+                          <w:rPr>
+                            <w:rFonts w:cstheme="minorHAnsi"/>
+                          </w:rPr>
+                          <w:tab/>
+                        </w:r>
+                        <w:r>
+                          <w:rPr>
+                            <w:rFonts w:cstheme="minorHAnsi"/>
+                          </w:rPr>
+                          <w:tab/>
+                        </w:r>
+                        <w:r>
+                          <w:rPr>
+                            <w:rFonts w:cstheme="minorHAnsi"/>
+                          </w:rPr>
+                          <w:tab/>
+                        </w:r>
+                        <w:r>
+                          <w:rPr>
+                            <w:rFonts w:cstheme="minorHAnsi"/>
+                          </w:rPr>
+                          <w:tab/>
+                        </w:r>
+                        <w:r>
+                          <w:rPr>
+                            <w:rFonts w:cstheme="minorHAnsi"/>
+                          </w:rPr>
+                          <w:tab/>
+                        </w:r>
+                        <w:proofErr w:type="gramStart"/>
+                        <w:r>
+                          <w:rPr>
+                            <w:rFonts w:cstheme="minorHAnsi"/>
+                          </w:rPr>
+                          <w:tab/>
+                          <w:t xml:space="preserve">  Firma</w:t>
+                        </w:r>
+                        <w:proofErr w:type="gramEnd"/>
+                        <w:r>
+                          <w:rPr>
+                            <w:rFonts w:cstheme="minorHAnsi"/>
+                          </w:rPr>
+                          <w:t xml:space="preserve"> del Docente</w:t>
+                        </w:r>
+                      </w:p>
+                      <w:p/>
+                    </w:txbxContent>
+                  </v:textbox>
+                </v:shape>
+                <v:shapetype id="_x0000_t75" coordsize="21600,21600" o:spt="75" o:preferrelative="t" path="m@4@5l@4@11@9@11@9@5xe" filled="f" stroked="f">
+                  <v:stroke joinstyle="miter"/>
+                  <v:formulas>
+                    <v:f eqn="if lineDrawn pixelLineWidth 0"/>
+                    <v:f eqn="sum @0 1 0"/>
+                    <v:f eqn="sum 0 0 @1"/>
+                    <v:f eqn="prod @2 1 2"/>
+                    <v:f eqn="prod @3 21600 pixelWidth"/>
+                    <v:f eqn="prod @3 21600 pixelHeight"/>
+                    <v:f eqn="sum @0 0 1"/>
+                    <v:f eqn="prod @6 1 2"/>
+                    <v:f eqn="prod @7 21600 pixelWidth"/>
+                    <v:f eqn="sum @8 21600 0"/>
+                    <v:f eqn="prod @7 21600 pixelHeight"/>
+                    <v:f eqn="sum @10 21600 0"/>
+                  </v:formulas>
+                  <v:path o:extrusionok="f" gradientshapeok="t" o:connecttype="rect"/>
+                  <o:lock v:ext="edit" aspectratio="t"/>
+                </v:shapetype>
+                <v:shape id="Imagen 2" o:spid="_x0000_s1028" type="#_x0000_t75" style="position:absolute;left:35687;width:16002;height:7556;visibility:visible;mso-wrap-style:square" o:gfxdata="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">
+                  <v:imagedata r:id="rId8" o:title="" croptop="14457f" cropbottom="12850f"/>
+                </v:shape>
+                <v:shape id="Imagen 3" o:spid="_x0000_s1029" type="#_x0000_t75" style="position:absolute;top:825;width:17208;height:6350;visibility:visible;mso-wrap-style:square" o:gfxdata="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">
+                  <v:imagedata r:id="rId9" o:title=""/>
+                </v:shape>
+              </v:group>
             </w:pict>
           </mc:Fallback>
         </mc:AlternateContent>
+      </w:r>
+      <w:r>
+        <w:rPr>
+          <w:rFonts w:cstheme="minorHAnsi"/>
+        </w:rPr>
+        <w:t> </w:t>
       </w:r>
     </w:p>
     <w:sectPr>

</xml_diff>